<commit_message>
implemented processing data from JSON Instructions
</commit_message>
<xml_diff>
--- a/template.docx
+++ b/template.docx
@@ -33,41 +33,115 @@
         </w:rPr>
       </w:pPr>
       <w:r>
-        <w:pict w14:anchorId="51265098">
-          <v:rect id="_x0000_i1045" style="width:0;height:.75pt" o:hralign="center" o:hrstd="t" o:hr="t" fillcolor="#a0a0a0" stroked="f"/>
-        </w:pict>
+        <w:rPr>
+          <w:b/>
+          <w:bCs/>
+          <w:sz w:val="32"/>
+          <w:szCs w:val="32"/>
+        </w:rPr>
+        <w:t>{{</w:t>
+      </w:r>
+      <w:proofErr w:type="spellStart"/>
+      <w:r>
+        <w:rPr>
+          <w:b/>
+          <w:bCs/>
+          <w:sz w:val="32"/>
+          <w:szCs w:val="32"/>
+        </w:rPr>
+        <w:t>today_date</w:t>
+      </w:r>
+      <w:proofErr w:type="spellEnd"/>
+      <w:r>
+        <w:rPr>
+          <w:b/>
+          <w:bCs/>
+          <w:sz w:val="32"/>
+          <w:szCs w:val="32"/>
+        </w:rPr>
+        <w:t>}}</w:t>
       </w:r>
     </w:p>
     <w:p>
-      <w:r>
-        <w:t>Inspection Date: {{date}}</w:t>
+      <w:pPr>
+        <w:jc w:val="center"/>
+        <w:rPr>
+          <w:b/>
+          <w:bCs/>
+          <w:sz w:val="32"/>
+          <w:szCs w:val="32"/>
+        </w:rPr>
+      </w:pPr>
+      <w:r>
+        <w:pict w14:anchorId="51265098">
+          <v:rect id="_x0000_i1025" style="width:0;height:.75pt" o:hralign="center" o:hrstd="t" o:hr="t" fillcolor="#a0a0a0" stroked="f"/>
+        </w:pict>
       </w:r>
     </w:p>
     <w:p>
       <w:r>
-        <w:t>Species Observed: {{species}}</w:t>
+        <w:t>Inspection Date: {{date}}</w:t>
       </w:r>
     </w:p>
     <w:p>
       <w:r>
-        <w:t>Address: {{address}}</w:t>
+        <w:t>Species Observed: {{species}}</w:t>
       </w:r>
     </w:p>
     <w:p>
-      <w:r>
-        <w:t>Inspector: {{inspector}}</w:t>
+      <w:proofErr w:type="gramStart"/>
+      <w:r>
+        <w:t>SPEACIES :</w:t>
+      </w:r>
+      <w:proofErr w:type="gramEnd"/>
+      <w:r>
+        <w:t xml:space="preserve"> </w:t>
+      </w:r>
+      <w:r>
+        <w:t>{{</w:t>
+      </w:r>
+      <w:proofErr w:type="spellStart"/>
+      <w:r>
+        <w:t>species_upper</w:t>
+      </w:r>
+      <w:proofErr w:type="spellEnd"/>
+      <w:r>
+        <w:t>}}</w:t>
       </w:r>
     </w:p>
     <w:p>
       <w:r>
-        <w:t>Notes: {{notes}}</w:t>
+        <w:t>Address: {{address}}</w:t>
       </w:r>
     </w:p>
     <w:p>
       <w:r>
+        <w:t>Inspector: {{inspector}}</w:t>
+      </w:r>
+    </w:p>
+    <w:p>
+      <w:r>
+        <w:t>Notes: {{notes}}</w:t>
+      </w:r>
+    </w:p>
+    <w:p>
+      <w:r>
         <w:pict w14:anchorId="519AB4DA">
-          <v:rect id="_x0000_i1043" style="width:0;height:.75pt" o:hralign="center" o:hrstd="t" o:hr="t" fillcolor="#a0a0a0" stroked="f"/>
+          <v:rect id="_x0000_i1029" style="width:0;height:.75pt" o:hralign="center" o:bullet="t" o:hrstd="t" o:hr="t" fillcolor="#a0a0a0" stroked="f"/>
         </w:pict>
+      </w:r>
+    </w:p>
+    <w:p>
+      <w:r>
+        <w:t>{{</w:t>
+      </w:r>
+      <w:proofErr w:type="spellStart"/>
+      <w:r>
+        <w:t>full_line</w:t>
+      </w:r>
+      <w:proofErr w:type="spellEnd"/>
+      <w:r>
+        <w:t>}}</w:t>
       </w:r>
     </w:p>
     <w:p>
@@ -1002,6 +1076,36 @@
       <w:spacing w:val="5"/>
     </w:rPr>
   </w:style>
+  <w:style w:type="paragraph" w:styleId="PrformatHTML">
+    <w:name w:val="HTML Preformatted"/>
+    <w:basedOn w:val="Normal"/>
+    <w:link w:val="PrformatHTMLCar"/>
+    <w:uiPriority w:val="99"/>
+    <w:semiHidden/>
+    <w:unhideWhenUsed/>
+    <w:rsid w:val="009E1985"/>
+    <w:pPr>
+      <w:spacing w:after="0" w:line="240" w:lineRule="auto"/>
+    </w:pPr>
+    <w:rPr>
+      <w:rFonts w:ascii="Consolas" w:hAnsi="Consolas"/>
+      <w:sz w:val="20"/>
+      <w:szCs w:val="20"/>
+    </w:rPr>
+  </w:style>
+  <w:style w:type="character" w:customStyle="1" w:styleId="PrformatHTMLCar">
+    <w:name w:val="Préformaté HTML Car"/>
+    <w:basedOn w:val="Policepardfaut"/>
+    <w:link w:val="PrformatHTML"/>
+    <w:uiPriority w:val="99"/>
+    <w:semiHidden/>
+    <w:rsid w:val="009E1985"/>
+    <w:rPr>
+      <w:rFonts w:ascii="Consolas" w:hAnsi="Consolas"/>
+      <w:sz w:val="20"/>
+      <w:szCs w:val="20"/>
+    </w:rPr>
+  </w:style>
 </w:styles>
 </file>
 

</xml_diff>

<commit_message>
rapport generation working need to refactored it
</commit_message>
<xml_diff>
--- a/template.docx
+++ b/template.docx
@@ -32,6 +32,26 @@
           <w:szCs w:val="32"/>
         </w:rPr>
       </w:pPr>
+      <w:proofErr w:type="gramStart"/>
+      <w:r>
+        <w:rPr>
+          <w:b/>
+          <w:bCs/>
+          <w:sz w:val="32"/>
+          <w:szCs w:val="32"/>
+        </w:rPr>
+        <w:t>Rapport :</w:t>
+      </w:r>
+      <w:proofErr w:type="gramEnd"/>
+      <w:r>
+        <w:rPr>
+          <w:b/>
+          <w:bCs/>
+          <w:sz w:val="32"/>
+          <w:szCs w:val="32"/>
+        </w:rPr>
+        <w:t xml:space="preserve"> </w:t>
+      </w:r>
       <w:r>
         <w:rPr>
           <w:b/>
@@ -49,7 +69,7 @@
           <w:sz w:val="32"/>
           <w:szCs w:val="32"/>
         </w:rPr>
-        <w:t>today_date</w:t>
+        <w:t>report_number</w:t>
       </w:r>
       <w:proofErr w:type="spellEnd"/>
       <w:r>
@@ -73,6 +93,46 @@
         </w:rPr>
       </w:pPr>
       <w:r>
+        <w:rPr>
+          <w:b/>
+          <w:bCs/>
+          <w:sz w:val="32"/>
+          <w:szCs w:val="32"/>
+        </w:rPr>
+        <w:t>{{</w:t>
+      </w:r>
+      <w:proofErr w:type="spellStart"/>
+      <w:r>
+        <w:rPr>
+          <w:b/>
+          <w:bCs/>
+          <w:sz w:val="32"/>
+          <w:szCs w:val="32"/>
+        </w:rPr>
+        <w:t>today_date</w:t>
+      </w:r>
+      <w:proofErr w:type="spellEnd"/>
+      <w:r>
+        <w:rPr>
+          <w:b/>
+          <w:bCs/>
+          <w:sz w:val="32"/>
+          <w:szCs w:val="32"/>
+        </w:rPr>
+        <w:t>}}</w:t>
+      </w:r>
+    </w:p>
+    <w:p>
+      <w:pPr>
+        <w:jc w:val="center"/>
+        <w:rPr>
+          <w:b/>
+          <w:bCs/>
+          <w:sz w:val="32"/>
+          <w:szCs w:val="32"/>
+        </w:rPr>
+      </w:pPr>
+      <w:r>
         <w:pict w14:anchorId="51265098">
           <v:rect id="_x0000_i1025" style="width:0;height:.75pt" o:hralign="center" o:hrstd="t" o:hr="t" fillcolor="#a0a0a0" stroked="f"/>
         </w:pict>
@@ -127,7 +187,7 @@
     <w:p>
       <w:r>
         <w:pict w14:anchorId="519AB4DA">
-          <v:rect id="_x0000_i1029" style="width:0;height:.75pt" o:hralign="center" o:bullet="t" o:hrstd="t" o:hr="t" fillcolor="#a0a0a0" stroked="f"/>
+          <v:rect id="_x0000_i1026" style="width:0;height:.75pt" o:hralign="center" o:bullet="t" o:hrstd="t" o:hr="t" fillcolor="#a0a0a0" stroked="f"/>
         </w:pict>
       </w:r>
     </w:p>

</xml_diff>